<commit_message>
Compare fixes the variant mismatch: both editions render the same unsigned view
The preserved 'old' editions now also produce the signed/unsigned pair, so the
compared PDFs are both the unsigned (no back-cover card) variant — it no longer
looks like signed-vs-unsigned (seen on Articles). Diffs are cleaner (Tax 3).

Co-Authored-By: Claude Opus 4.8 <noreply@anthropic.com>
Claude-Session: https://claude.ai/code/session_01W3gw8scX9B7oMC33JPxjbS
</commit_message>
<xml_diff>
--- a/docs/files/Articles_of_Association__Policy_2026-04.docx
+++ b/docs/files/Articles_of_Association__Policy_2026-04.docx
@@ -19,7 +19,7 @@
               <a:graphicData uri="http://schemas.openxmlformats.org/drawingml/2006/picture">
                 <pic:pic>
                   <pic:nvPicPr>
-                    <pic:cNvPr id="0" name="tmpg3u2_mmg.png"/>
+                    <pic:cNvPr id="0" name="tmpb7xhe49l.png"/>
                     <pic:cNvPicPr/>
                   </pic:nvPicPr>
                   <pic:blipFill>
@@ -1269,127 +1269,6 @@
         <w:t>As adopted at the extraordinary general meeting on 13 May 2026.</w:t>
       </w:r>
     </w:p>
-    <w:p/>
-    <w:tbl>
-      <w:tblPr>
-        <w:tblStyle w:val="TableGrid"/>
-        <w:tblW w:type="auto" w:w="0"/>
-        <w:jc w:val="center"/>
-        <w:tblLook w:firstColumn="1" w:firstRow="1" w:lastColumn="0" w:lastRow="0" w:noHBand="0" w:noVBand="1" w:val="04A0"/>
-      </w:tblPr>
-      <w:tblGrid>
-        <w:gridCol w:w="5103"/>
-        <w:gridCol w:w="5103"/>
-      </w:tblGrid>
-      <w:tr>
-        <w:tc>
-          <w:tcPr>
-            <w:tcW w:type="dxa" w:w="5103"/>
-            <w:shd w:val="clear" w:fill="1C4076"/>
-          </w:tcPr>
-          <w:p>
-            <w:r>
-              <w:rPr>
-                <w:rFonts w:ascii="Avenir Next LT Pro" w:hAnsi="Avenir Next LT Pro"/>
-                <w:b/>
-                <w:color w:val="FFFFFF"/>
-                <w:sz w:val="20"/>
-              </w:rPr>
-              <w:t>Version history</w:t>
-            </w:r>
-          </w:p>
-        </w:tc>
-        <w:tc>
-          <w:tcPr>
-            <w:tcW w:type="dxa" w:w="5103"/>
-            <w:shd w:val="clear" w:fill="1C4076"/>
-          </w:tcPr>
-          <w:p>
-            <w:r>
-              <w:rPr>
-                <w:rFonts w:ascii="Avenir Next LT Pro" w:hAnsi="Avenir Next LT Pro"/>
-                <w:b/>
-                <w:color w:val="FFFFFF"/>
-                <w:sz w:val="20"/>
-              </w:rPr>
-              <w:t>Owner and approver</w:t>
-            </w:r>
-          </w:p>
-        </w:tc>
-      </w:tr>
-      <w:tr>
-        <w:tc>
-          <w:tcPr>
-            <w:tcW w:type="dxa" w:w="5103"/>
-          </w:tcPr>
-          <w:p>
-            <w:r>
-              <w:rPr>
-                <w:rFonts w:ascii="Avenir Next LT Pro" w:hAnsi="Avenir Next LT Pro"/>
-                <w:b/>
-                <w:color w:val="1C4076"/>
-                <w:sz w:val="18"/>
-              </w:rPr>
-              <w:t xml:space="preserve">Version 1: </w:t>
-            </w:r>
-            <w:r>
-              <w:rPr>
-                <w:rFonts w:ascii="Avenir Next LT Pro" w:hAnsi="Avenir Next LT Pro"/>
-                <w:b w:val="0"/>
-                <w:color w:val="1C4076"/>
-                <w:sz w:val="18"/>
-              </w:rPr>
-              <w:t>April 2026</w:t>
-            </w:r>
-          </w:p>
-        </w:tc>
-        <w:tc>
-          <w:tcPr>
-            <w:tcW w:type="dxa" w:w="5103"/>
-          </w:tcPr>
-          <w:p>
-            <w:r>
-              <w:rPr>
-                <w:rFonts w:ascii="Avenir Next LT Pro" w:hAnsi="Avenir Next LT Pro"/>
-                <w:b/>
-                <w:color w:val="1C4076"/>
-                <w:sz w:val="18"/>
-              </w:rPr>
-              <w:t xml:space="preserve">Owner: </w:t>
-            </w:r>
-            <w:r>
-              <w:rPr>
-                <w:rFonts w:ascii="Avenir Next LT Pro" w:hAnsi="Avenir Next LT Pro"/>
-                <w:b w:val="0"/>
-                <w:color w:val="1C4076"/>
-                <w:sz w:val="18"/>
-              </w:rPr>
-              <w:t>Group Legal</w:t>
-            </w:r>
-          </w:p>
-          <w:p>
-            <w:r>
-              <w:rPr>
-                <w:rFonts w:ascii="Avenir Next LT Pro" w:hAnsi="Avenir Next LT Pro"/>
-                <w:b/>
-                <w:color w:val="1C4076"/>
-                <w:sz w:val="18"/>
-              </w:rPr>
-              <w:t xml:space="preserve">Approver: </w:t>
-            </w:r>
-            <w:r>
-              <w:rPr>
-                <w:rFonts w:ascii="Avenir Next LT Pro" w:hAnsi="Avenir Next LT Pro"/>
-                <w:b w:val="0"/>
-                <w:color w:val="1C4076"/>
-                <w:sz w:val="18"/>
-              </w:rPr>
-              <w:t>General Meeting</w:t>
-            </w:r>
-          </w:p>
-        </w:tc>
-      </w:tr>
-    </w:tbl>
     <w:sectPr>
       <w:headerReference w:type="default" r:id="rId10"/>
       <w:footerReference w:type="default" r:id="rId11"/>

</xml_diff>